<commit_message>
Lab 2 Codespaces: corrige comandos bash del instructor y descripcion de fork
Co-authored-by: Copilot App <223556219+Copilot@users.noreply.github.com>
Copilot-Session: e59430c6-8a11-4f9c-954f-b3eb6b54fdb8
</commit_message>
<xml_diff>
--- a/laboratorios/dia2-lab-procode-codespaces/Guia_del_participante_Dia2.docx
+++ b/laboratorios/dia2-lab-procode-codespaces/Guia_del_participante_Dia2.docx
@@ -2045,7 +2045,7 @@
       </w:r>
       <w:r>
         <w:rPr/>
-        <w:t xml:space="preserve">). Si no tienes permisos de escritura, GitHub crea el Codespace sobre un </w:t>
+        <w:t xml:space="preserve">). Si no tienes permisos de escritura, el Codespace se crea igual desde el repositorio público; GitHub solo crea o enlaza un </w:t>
       </w:r>
       <w:r>
         <w:rPr>
@@ -2055,7 +2055,7 @@
       </w:r>
       <w:r>
         <w:rPr/>
-        <w:t xml:space="preserve"> tuyo: es lo esperado.</w:t>
+        <w:t xml:space="preserve"> tuyo si luego haces commit o push (no lo necesitas en este laboratorio).</w:t>
       </w:r>
     </w:p>
     <w:p>

</xml_diff>

<commit_message>
Lab 2 Codespaces: agrega seccion 0 con que es Codespaces y como usarlo
Co-authored-by: Copilot App <223556219+Copilot@users.noreply.github.com>
Copilot-Session: e59430c6-8a11-4f9c-954f-b3eb6b54fdb8
</commit_message>
<xml_diff>
--- a/laboratorios/dia2-lab-procode-codespaces/Guia_del_participante_Dia2.docx
+++ b/laboratorios/dia2-lab-procode-codespaces/Guia_del_participante_Dia2.docx
@@ -222,6 +222,910 @@
       <w:r>
         <w:rPr/>
         <w:t>.</w:t>
+      </w:r>
+    </w:p>
+    <w:p>
+      <w:pPr>
+        <w:pBdr>
+          <w:bottom w:val="single" w:sz="6" w:space="1" w:color="A6A6A6"/>
+        </w:pBdr>
+      </w:pPr>
+    </w:p>
+    <w:p>
+      <w:pPr>
+        <w:pStyle w:val="Heading2"/>
+      </w:pPr>
+      <w:r>
+        <w:rPr/>
+        <w:t>0. Antes de empezar: qué es GitHub Codespaces y cómo usarlo</w:t>
+      </w:r>
+    </w:p>
+    <w:p>
+      <w:r>
+        <w:rPr>
+          <w:b/>
+        </w:rPr>
+        <w:t>¿Qué es?</w:t>
+      </w:r>
+      <w:r>
+        <w:rPr/>
+        <w:t xml:space="preserve"> GitHub Codespaces es un </w:t>
+      </w:r>
+      <w:r>
+        <w:rPr>
+          <w:b/>
+        </w:rPr>
+        <w:t>entorno de desarrollo en la nube</w:t>
+      </w:r>
+      <w:r>
+        <w:rPr/>
+        <w:t>: GitHub crea para ti una máquina virtual (un contenedor Linux)</w:t>
+      </w:r>
+      <w:r>
+        <w:rPr/>
+        <w:t xml:space="preserve"> con una copia del repositorio y abre </w:t>
+      </w:r>
+      <w:r>
+        <w:rPr>
+          <w:b/>
+        </w:rPr>
+        <w:t>Visual Studio Code dentro del navegador</w:t>
+      </w:r>
+      <w:r>
+        <w:rPr/>
+        <w:t xml:space="preserve">. Todo lo que ejecutes (Python, </w:t>
+      </w:r>
+      <w:r>
+        <w:rPr>
+          <w:rFonts w:ascii="Consolas" w:hAnsi="Consolas"/>
+          <w:color w:val="9C2B2B"/>
+        </w:rPr>
+        <w:t>az</w:t>
+      </w:r>
+      <w:r>
+        <w:rPr/>
+        <w:t xml:space="preserve">, </w:t>
+      </w:r>
+      <w:r>
+        <w:rPr>
+          <w:rFonts w:ascii="Consolas" w:hAnsi="Consolas"/>
+          <w:color w:val="9C2B2B"/>
+        </w:rPr>
+        <w:t>pytest</w:t>
+      </w:r>
+      <w:r>
+        <w:rPr/>
+        <w:t>) corre en esa máquina, no en tu equipo.</w:t>
+      </w:r>
+      <w:r>
+        <w:rPr/>
+        <w:t xml:space="preserve"> Para este laboratorio el contenedor ya trae </w:t>
+      </w:r>
+      <w:r>
+        <w:rPr>
+          <w:b/>
+        </w:rPr>
+        <w:t>Python 3.12, Azure CLI y las dependencias instaladas</w:t>
+      </w:r>
+      <w:r>
+        <w:rPr/>
+        <w:t>, porque así lo define el archivo</w:t>
+      </w:r>
+      <w:r>
+        <w:rPr/>
+        <w:t xml:space="preserve"> </w:t>
+      </w:r>
+      <w:r>
+        <w:rPr>
+          <w:rFonts w:ascii="Consolas" w:hAnsi="Consolas"/>
+          <w:color w:val="9C2B2B"/>
+        </w:rPr>
+        <w:t>.devcontainer/dia2-lab-procode-codespaces/devcontainer.json</w:t>
+      </w:r>
+      <w:r>
+        <w:rPr/>
+        <w:t xml:space="preserve"> del repositorio. Por eso tu versión de Python local no importa.</w:t>
+      </w:r>
+    </w:p>
+    <w:p>
+      <w:r>
+        <w:rPr>
+          <w:b/>
+        </w:rPr>
+        <w:t>Qué ves al abrirlo</w:t>
+      </w:r>
+      <w:r>
+        <w:rPr/>
+        <w:t xml:space="preserve"> (es el mismo VS Code que conoces):</w:t>
+      </w:r>
+    </w:p>
+    <w:tbl>
+      <w:tblPr>
+        <w:tblStyle w:val="TableGrid"/>
+        <w:tblW w:type="auto" w:w="0"/>
+        <w:tblLayout w:type="fixed"/>
+        <w:tblLook w:firstColumn="1" w:firstRow="1" w:lastColumn="0" w:lastRow="0" w:noHBand="0" w:noVBand="1" w:val="04A0"/>
+      </w:tblPr>
+      <w:tblGrid>
+        <w:gridCol w:w="4986"/>
+        <w:gridCol w:w="4986"/>
+      </w:tblGrid>
+      <w:tr>
+        <w:tc>
+          <w:tcPr>
+            <w:tcW w:type="dxa" w:w="4130"/>
+            <w:shd w:val="clear" w:color="auto" w:fill="DCE6F1"/>
+          </w:tcPr>
+          <w:p>
+            <w:pPr>
+              <w:spacing w:after="40"/>
+            </w:pPr>
+            <w:r>
+              <w:rPr>
+                <w:b/>
+                <w:sz w:val="18"/>
+              </w:rPr>
+              <w:t>Zona</w:t>
+            </w:r>
+          </w:p>
+        </w:tc>
+        <w:tc>
+          <w:tcPr>
+            <w:tcW w:type="dxa" w:w="5507"/>
+            <w:shd w:val="clear" w:color="auto" w:fill="DCE6F1"/>
+          </w:tcPr>
+          <w:p>
+            <w:pPr>
+              <w:spacing w:after="40"/>
+            </w:pPr>
+            <w:r>
+              <w:rPr>
+                <w:b/>
+                <w:sz w:val="18"/>
+              </w:rPr>
+              <w:t>Para qué la usas en el laboratorio</w:t>
+            </w:r>
+          </w:p>
+        </w:tc>
+      </w:tr>
+      <w:tr>
+        <w:tc>
+          <w:tcPr>
+            <w:tcW w:type="dxa" w:w="4130"/>
+          </w:tcPr>
+          <w:p>
+            <w:pPr>
+              <w:spacing w:after="40"/>
+            </w:pPr>
+            <w:r>
+              <w:rPr>
+                <w:sz w:val="18"/>
+              </w:rPr>
+              <w:t>Explorador de archivos (izquierda)</w:t>
+            </w:r>
+          </w:p>
+        </w:tc>
+        <w:tc>
+          <w:tcPr>
+            <w:tcW w:type="dxa" w:w="5507"/>
+          </w:tcPr>
+          <w:p>
+            <w:pPr>
+              <w:spacing w:after="40"/>
+            </w:pPr>
+            <w:r>
+              <w:rPr>
+                <w:sz w:val="18"/>
+              </w:rPr>
+              <w:t xml:space="preserve">Navegar por </w:t>
+            </w:r>
+            <w:r>
+              <w:rPr>
+                <w:rFonts w:ascii="Consolas" w:hAnsi="Consolas"/>
+                <w:color w:val="9C2B2B"/>
+                <w:sz w:val="18"/>
+              </w:rPr>
+              <w:t>src/</w:t>
+            </w:r>
+            <w:r>
+              <w:rPr>
+                <w:sz w:val="18"/>
+              </w:rPr>
+              <w:t xml:space="preserve">, </w:t>
+            </w:r>
+            <w:r>
+              <w:rPr>
+                <w:rFonts w:ascii="Consolas" w:hAnsi="Consolas"/>
+                <w:color w:val="9C2B2B"/>
+                <w:sz w:val="18"/>
+              </w:rPr>
+              <w:t>solutions/</w:t>
+            </w:r>
+            <w:r>
+              <w:rPr>
+                <w:sz w:val="18"/>
+              </w:rPr>
+              <w:t xml:space="preserve">, </w:t>
+            </w:r>
+            <w:r>
+              <w:rPr>
+                <w:rFonts w:ascii="Consolas" w:hAnsi="Consolas"/>
+                <w:color w:val="9C2B2B"/>
+                <w:sz w:val="18"/>
+              </w:rPr>
+              <w:t>data/</w:t>
+            </w:r>
+            <w:r>
+              <w:rPr>
+                <w:sz w:val="18"/>
+              </w:rPr>
+              <w:t xml:space="preserve"> y abrir los archivos de cada tarea</w:t>
+            </w:r>
+          </w:p>
+        </w:tc>
+      </w:tr>
+      <w:tr>
+        <w:tc>
+          <w:tcPr>
+            <w:tcW w:type="dxa" w:w="4130"/>
+          </w:tcPr>
+          <w:p>
+            <w:pPr>
+              <w:spacing w:after="40"/>
+            </w:pPr>
+            <w:r>
+              <w:rPr>
+                <w:sz w:val="18"/>
+              </w:rPr>
+              <w:t>Editor (centro)</w:t>
+            </w:r>
+          </w:p>
+        </w:tc>
+        <w:tc>
+          <w:tcPr>
+            <w:tcW w:type="dxa" w:w="5507"/>
+          </w:tcPr>
+          <w:p>
+            <w:pPr>
+              <w:spacing w:after="40"/>
+            </w:pPr>
+            <w:r>
+              <w:rPr>
+                <w:sz w:val="18"/>
+              </w:rPr>
+              <w:t xml:space="preserve">Completar los </w:t>
+            </w:r>
+            <w:r>
+              <w:rPr>
+                <w:rFonts w:ascii="Consolas" w:hAnsi="Consolas"/>
+                <w:color w:val="9C2B2B"/>
+                <w:sz w:val="18"/>
+              </w:rPr>
+              <w:t>TODO</w:t>
+            </w:r>
+            <w:r>
+              <w:rPr>
+                <w:sz w:val="18"/>
+              </w:rPr>
+              <w:t xml:space="preserve"> de los starters y leer este README</w:t>
+            </w:r>
+          </w:p>
+        </w:tc>
+      </w:tr>
+      <w:tr>
+        <w:tc>
+          <w:tcPr>
+            <w:tcW w:type="dxa" w:w="4130"/>
+          </w:tcPr>
+          <w:p>
+            <w:pPr>
+              <w:spacing w:after="40"/>
+            </w:pPr>
+            <w:r>
+              <w:rPr>
+                <w:sz w:val="18"/>
+              </w:rPr>
+              <w:t>Terminal (abajo)</w:t>
+            </w:r>
+          </w:p>
+        </w:tc>
+        <w:tc>
+          <w:tcPr>
+            <w:tcW w:type="dxa" w:w="5507"/>
+          </w:tcPr>
+          <w:p>
+            <w:pPr>
+              <w:spacing w:after="40"/>
+            </w:pPr>
+            <w:r>
+              <w:rPr>
+                <w:sz w:val="18"/>
+              </w:rPr>
+              <w:t>Ejecutar los comandos (</w:t>
+            </w:r>
+            <w:r>
+              <w:rPr>
+                <w:rFonts w:ascii="Consolas" w:hAnsi="Consolas"/>
+                <w:color w:val="9C2B2B"/>
+                <w:sz w:val="18"/>
+              </w:rPr>
+              <w:t>az login</w:t>
+            </w:r>
+            <w:r>
+              <w:rPr>
+                <w:sz w:val="18"/>
+              </w:rPr>
+              <w:t xml:space="preserve">, </w:t>
+            </w:r>
+            <w:r>
+              <w:rPr>
+                <w:rFonts w:ascii="Consolas" w:hAnsi="Consolas"/>
+                <w:color w:val="9C2B2B"/>
+                <w:sz w:val="18"/>
+              </w:rPr>
+              <w:t>python src/...</w:t>
+            </w:r>
+            <w:r>
+              <w:rPr>
+                <w:sz w:val="18"/>
+              </w:rPr>
+              <w:t xml:space="preserve">). Es </w:t>
+            </w:r>
+            <w:r>
+              <w:rPr>
+                <w:b/>
+                <w:sz w:val="18"/>
+              </w:rPr>
+              <w:t>bash (Linux)</w:t>
+            </w:r>
+            <w:r>
+              <w:rPr>
+                <w:sz w:val="18"/>
+              </w:rPr>
+              <w:t xml:space="preserve">: rutas con </w:t>
+            </w:r>
+            <w:r>
+              <w:rPr>
+                <w:rFonts w:ascii="Consolas" w:hAnsi="Consolas"/>
+                <w:color w:val="9C2B2B"/>
+                <w:sz w:val="18"/>
+              </w:rPr>
+              <w:t>/</w:t>
+            </w:r>
+          </w:p>
+        </w:tc>
+      </w:tr>
+      <w:tr>
+        <w:tc>
+          <w:tcPr>
+            <w:tcW w:type="dxa" w:w="4130"/>
+          </w:tcPr>
+          <w:p>
+            <w:pPr>
+              <w:spacing w:after="40"/>
+            </w:pPr>
+            <w:r>
+              <w:rPr>
+                <w:sz w:val="18"/>
+              </w:rPr>
+              <w:t>Barra de estado (esquina inferior izquierda, verde)</w:t>
+            </w:r>
+          </w:p>
+        </w:tc>
+        <w:tc>
+          <w:tcPr>
+            <w:tcW w:type="dxa" w:w="5507"/>
+          </w:tcPr>
+          <w:p>
+            <w:pPr>
+              <w:spacing w:after="40"/>
+            </w:pPr>
+            <w:r>
+              <w:rPr>
+                <w:sz w:val="18"/>
+              </w:rPr>
+              <w:t>Muestra el nombre del Codespace; haz clic para ver opciones (detener, reconstruir, etc.)</w:t>
+            </w:r>
+          </w:p>
+        </w:tc>
+      </w:tr>
+    </w:tbl>
+    <w:p>
+      <w:pPr>
+        <w:spacing w:after="40"/>
+      </w:pPr>
+    </w:p>
+    <w:p>
+      <w:r>
+        <w:rPr>
+          <w:b/>
+        </w:rPr>
+        <w:t>Cómo usarlo, paso a paso</w:t>
+      </w:r>
+    </w:p>
+    <w:p>
+      <w:pPr>
+        <w:spacing w:after="40"/>
+        <w:ind w:left="510" w:hanging="283"/>
+      </w:pPr>
+      <w:r>
+        <w:t xml:space="preserve">1. </w:t>
+      </w:r>
+      <w:r>
+        <w:rPr>
+          <w:b/>
+        </w:rPr>
+        <w:t>Créalo:</w:t>
+      </w:r>
+      <w:r>
+        <w:rPr/>
+        <w:t xml:space="preserve"> en el repositorio, botón verde </w:t>
+      </w:r>
+      <w:r>
+        <w:rPr>
+          <w:b/>
+        </w:rPr>
+        <w:t>Code</w:t>
+      </w:r>
+      <w:r>
+        <w:rPr/>
+        <w:t xml:space="preserve"> → pestaña </w:t>
+      </w:r>
+      <w:r>
+        <w:rPr>
+          <w:b/>
+        </w:rPr>
+        <w:t>Codespaces</w:t>
+      </w:r>
+      <w:r>
+        <w:rPr/>
+        <w:t xml:space="preserve"> → </w:t>
+      </w:r>
+      <w:r>
+        <w:rPr>
+          <w:b/>
+        </w:rPr>
+        <w:t>Create codespace on main</w:t>
+      </w:r>
+      <w:r>
+        <w:rPr/>
+        <w:t xml:space="preserve"> (máquina de 2 núcleos). El detalle está en la sección 5.1.</w:t>
+      </w:r>
+    </w:p>
+    <w:p>
+      <w:pPr>
+        <w:spacing w:after="40"/>
+        <w:ind w:left="510" w:hanging="283"/>
+      </w:pPr>
+      <w:r>
+        <w:t xml:space="preserve">2. </w:t>
+      </w:r>
+      <w:r>
+        <w:rPr>
+          <w:b/>
+        </w:rPr>
+        <w:t>Espera</w:t>
+      </w:r>
+      <w:r>
+        <w:rPr/>
+        <w:t xml:space="preserve"> 2–4 min la primera vez: el contenedor se construye e instala las dependencias solo. Cuando termine verás el editor y este README abierto.</w:t>
+      </w:r>
+    </w:p>
+    <w:p>
+      <w:pPr>
+        <w:spacing w:after="40"/>
+        <w:ind w:left="510" w:hanging="283"/>
+      </w:pPr>
+      <w:r>
+        <w:t xml:space="preserve">3. </w:t>
+      </w:r>
+      <w:r>
+        <w:rPr>
+          <w:b/>
+        </w:rPr>
+        <w:t>Abre el terminal:</w:t>
+      </w:r>
+      <w:r>
+        <w:rPr/>
+        <w:t xml:space="preserve"> menú </w:t>
+      </w:r>
+      <w:r>
+        <w:rPr>
+          <w:b/>
+        </w:rPr>
+        <w:t>Terminal → Nuevo terminal</w:t>
+      </w:r>
+      <w:r>
+        <w:rPr/>
+        <w:t xml:space="preserve">. Los comandos de esta guía se </w:t>
+      </w:r>
+      <w:r>
+        <w:rPr>
+          <w:b/>
+        </w:rPr>
+        <w:t>copian y pegan ahí</w:t>
+      </w:r>
+      <w:r>
+        <w:rPr/>
+        <w:t xml:space="preserve"> (si el navegador pide permiso para usar el portapapeles, acéptalo).</w:t>
+      </w:r>
+    </w:p>
+    <w:p>
+      <w:pPr>
+        <w:spacing w:after="40"/>
+        <w:ind w:left="510" w:hanging="283"/>
+      </w:pPr>
+      <w:r>
+        <w:t xml:space="preserve">4. </w:t>
+      </w:r>
+      <w:r>
+        <w:rPr>
+          <w:b/>
+        </w:rPr>
+        <w:t>Edita y guarda:</w:t>
+      </w:r>
+      <w:r>
+        <w:rPr/>
+        <w:t xml:space="preserve"> abre el archivo de la tarea en el explorador, modifícalo y guárdalo (</w:t>
+      </w:r>
+      <w:r>
+        <w:rPr>
+          <w:b/>
+        </w:rPr>
+        <w:t>Ctrl+S</w:t>
+      </w:r>
+      <w:r>
+        <w:rPr/>
+        <w:t xml:space="preserve">, o </w:t>
+      </w:r>
+      <w:r>
+        <w:rPr>
+          <w:b/>
+        </w:rPr>
+        <w:t>Cmd+S</w:t>
+      </w:r>
+      <w:r>
+        <w:rPr/>
+        <w:t xml:space="preserve"> en Mac) antes de ejecutarlo.</w:t>
+      </w:r>
+    </w:p>
+    <w:p>
+      <w:pPr>
+        <w:spacing w:after="40"/>
+        <w:ind w:left="510" w:hanging="283"/>
+      </w:pPr>
+      <w:r>
+        <w:t xml:space="preserve">5. </w:t>
+      </w:r>
+      <w:r>
+        <w:rPr>
+          <w:b/>
+        </w:rPr>
+        <w:t>Ejecuta</w:t>
+      </w:r>
+      <w:r>
+        <w:rPr/>
+        <w:t xml:space="preserve"> desde el terminal, por ejemplo </w:t>
+      </w:r>
+      <w:r>
+        <w:rPr>
+          <w:rFonts w:ascii="Consolas" w:hAnsi="Consolas"/>
+          <w:color w:val="9C2B2B"/>
+        </w:rPr>
+        <w:t>python src/02_agente_base.py</w:t>
+      </w:r>
+      <w:r>
+        <w:rPr/>
+        <w:t>. No necesitas crear un entorno virtual.</w:t>
+      </w:r>
+    </w:p>
+    <w:p>
+      <w:r>
+        <w:rPr>
+          <w:b/>
+        </w:rPr>
+        <w:t>Cómo detenerlo y volver a él</w:t>
+      </w:r>
+    </w:p>
+    <w:p>
+      <w:pPr>
+        <w:spacing w:after="40"/>
+        <w:ind w:left="510" w:hanging="283"/>
+      </w:pPr>
+      <w:r>
+        <w:t xml:space="preserve">• </w:t>
+      </w:r>
+      <w:r>
+        <w:rPr/>
+        <w:t xml:space="preserve">Cerrar la pestaña </w:t>
+      </w:r>
+      <w:r>
+        <w:rPr>
+          <w:b/>
+        </w:rPr>
+        <w:t>no</w:t>
+      </w:r>
+      <w:r>
+        <w:rPr/>
+        <w:t xml:space="preserve"> lo detiene: se apaga solo tras 30 min de inactividad (consume tu cuota de 120 core-horas/mes mientras está encendido).</w:t>
+      </w:r>
+    </w:p>
+    <w:p>
+      <w:pPr>
+        <w:spacing w:after="40"/>
+        <w:ind w:left="510" w:hanging="283"/>
+      </w:pPr>
+      <w:r>
+        <w:t xml:space="preserve">• </w:t>
+      </w:r>
+      <w:r>
+        <w:rPr/>
+        <w:t xml:space="preserve">Para </w:t>
+      </w:r>
+      <w:r>
+        <w:rPr>
+          <w:b/>
+        </w:rPr>
+        <w:t>retomarlo</w:t>
+      </w:r>
+      <w:r>
+        <w:rPr/>
+        <w:t xml:space="preserve">, entra a </w:t>
+      </w:r>
+      <w:r>
+        <w:rPr>
+          <w:rFonts w:ascii="Consolas" w:hAnsi="Consolas"/>
+          <w:color w:val="9C2B2B"/>
+        </w:rPr>
+        <w:t>https://github.com/codespaces</w:t>
+      </w:r>
+      <w:r>
+        <w:rPr/>
+        <w:t xml:space="preserve"> y haz clic en tu Codespace: conserva tus archivos, el </w:t>
+      </w:r>
+      <w:r>
+        <w:rPr>
+          <w:rFonts w:ascii="Consolas" w:hAnsi="Consolas"/>
+          <w:color w:val="9C2B2B"/>
+        </w:rPr>
+        <w:t>.env</w:t>
+      </w:r>
+      <w:r>
+        <w:rPr/>
+        <w:t xml:space="preserve"> y la sesión de </w:t>
+      </w:r>
+      <w:r>
+        <w:rPr>
+          <w:rFonts w:ascii="Consolas" w:hAnsi="Consolas"/>
+          <w:color w:val="9C2B2B"/>
+        </w:rPr>
+        <w:t>az login</w:t>
+      </w:r>
+      <w:r>
+        <w:rPr/>
+        <w:t xml:space="preserve"> mientras no lo elimines (si </w:t>
+      </w:r>
+      <w:r>
+        <w:rPr>
+          <w:rFonts w:ascii="Consolas" w:hAnsi="Consolas"/>
+          <w:color w:val="9C2B2B"/>
+        </w:rPr>
+        <w:t>az</w:t>
+      </w:r>
+      <w:r>
+        <w:rPr/>
+        <w:t xml:space="preserve"> pide iniciar sesión de nuevo, repite el paso 5.2).</w:t>
+      </w:r>
+    </w:p>
+    <w:p>
+      <w:pPr>
+        <w:spacing w:after="40"/>
+        <w:ind w:left="510" w:hanging="283"/>
+      </w:pPr>
+      <w:r>
+        <w:t xml:space="preserve">• </w:t>
+      </w:r>
+      <w:r>
+        <w:rPr/>
+        <w:t xml:space="preserve">Al terminar el laboratorio, en </w:t>
+      </w:r>
+      <w:r>
+        <w:rPr>
+          <w:rFonts w:ascii="Consolas" w:hAnsi="Consolas"/>
+          <w:color w:val="9C2B2B"/>
+        </w:rPr>
+        <w:t>https://github.com/codespaces</w:t>
+      </w:r>
+      <w:r>
+        <w:rPr/>
+        <w:t xml:space="preserve"> abre el menú </w:t>
+      </w:r>
+      <w:r>
+        <w:rPr>
+          <w:b/>
+        </w:rPr>
+        <w:t>…</w:t>
+      </w:r>
+      <w:r>
+        <w:rPr/>
+        <w:t xml:space="preserve"> de tu Codespace y elige </w:t>
+      </w:r>
+      <w:r>
+        <w:rPr>
+          <w:b/>
+        </w:rPr>
+        <w:t>Stop codespace</w:t>
+      </w:r>
+      <w:r>
+        <w:rPr/>
+        <w:t xml:space="preserve">. </w:t>
+      </w:r>
+      <w:r>
+        <w:rPr>
+          <w:b/>
+        </w:rPr>
+        <w:t>Delete</w:t>
+      </w:r>
+      <w:r>
+        <w:rPr/>
+        <w:t xml:space="preserve"> lo elimina por completo, incluido el </w:t>
+      </w:r>
+      <w:r>
+        <w:rPr>
+          <w:rFonts w:ascii="Consolas" w:hAnsi="Consolas"/>
+          <w:color w:val="9C2B2B"/>
+        </w:rPr>
+        <w:t>.env</w:t>
+      </w:r>
+      <w:r>
+        <w:rPr/>
+        <w:t xml:space="preserve"> y cualquier cambio que hayas hecho.</w:t>
+      </w:r>
+    </w:p>
+    <w:p>
+      <w:r>
+        <w:rPr>
+          <w:b/>
+        </w:rPr>
+        <w:t>Buenas prácticas</w:t>
+      </w:r>
+    </w:p>
+    <w:p>
+      <w:pPr>
+        <w:spacing w:after="40"/>
+        <w:ind w:left="510" w:hanging="283"/>
+      </w:pPr>
+      <w:r>
+        <w:t xml:space="preserve">• </w:t>
+      </w:r>
+      <w:r>
+        <w:rPr/>
+        <w:t xml:space="preserve">Trabaja solo dentro de la carpeta </w:t>
+      </w:r>
+      <w:r>
+        <w:rPr>
+          <w:rFonts w:ascii="Consolas" w:hAnsi="Consolas"/>
+          <w:color w:val="9C2B2B"/>
+        </w:rPr>
+        <w:t>laboratorios/dia2-lab-procode-codespaces</w:t>
+      </w:r>
+      <w:r>
+        <w:rPr/>
+        <w:t xml:space="preserve">; los cambios que hagas quedan en </w:t>
+      </w:r>
+      <w:r>
+        <w:rPr>
+          <w:b/>
+        </w:rPr>
+        <w:t>tu</w:t>
+      </w:r>
+      <w:r>
+        <w:rPr/>
+        <w:t xml:space="preserve"> Codespace y no afectan el repositorio original (no necesitas hacer commit ni push).</w:t>
+      </w:r>
+    </w:p>
+    <w:p>
+      <w:pPr>
+        <w:spacing w:after="40"/>
+        <w:ind w:left="510" w:hanging="283"/>
+      </w:pPr>
+      <w:r>
+        <w:t xml:space="preserve">• </w:t>
+      </w:r>
+      <w:r>
+        <w:rPr/>
+        <w:t xml:space="preserve">El archivo </w:t>
+      </w:r>
+      <w:r>
+        <w:rPr>
+          <w:rFonts w:ascii="Consolas" w:hAnsi="Consolas"/>
+          <w:color w:val="9C2B2B"/>
+        </w:rPr>
+        <w:t>.env</w:t>
+      </w:r>
+      <w:r>
+        <w:rPr/>
+        <w:t xml:space="preserve"> está en </w:t>
+      </w:r>
+      <w:r>
+        <w:rPr>
+          <w:rFonts w:ascii="Consolas" w:hAnsi="Consolas"/>
+          <w:color w:val="9C2B2B"/>
+        </w:rPr>
+        <w:t>.gitignore</w:t>
+      </w:r>
+      <w:r>
+        <w:rPr/>
+        <w:t>: no se sube a GitHub. No pegues en él llaves ni secretos; este laboratorio usa Microsoft Entra ID (</w:t>
+      </w:r>
+      <w:r>
+        <w:rPr>
+          <w:rFonts w:ascii="Consolas" w:hAnsi="Consolas"/>
+          <w:color w:val="9C2B2B"/>
+        </w:rPr>
+        <w:t>az login</w:t>
+      </w:r>
+      <w:r>
+        <w:rPr/>
+        <w:t>), no llaves.</w:t>
+      </w:r>
+    </w:p>
+    <w:p>
+      <w:pPr>
+        <w:spacing w:after="40"/>
+        <w:ind w:left="510" w:hanging="283"/>
+      </w:pPr>
+      <w:r>
+        <w:t xml:space="preserve">• </w:t>
+      </w:r>
+      <w:r>
+        <w:rPr/>
+        <w:t>Si el editor queda cargando o el terminal no responde, recarga la pestaña del navegador (</w:t>
+      </w:r>
+      <w:r>
+        <w:rPr>
+          <w:b/>
+        </w:rPr>
+        <w:t>F5</w:t>
+      </w:r>
+      <w:r>
+        <w:rPr/>
+        <w:t>); el Codespace sigue encendido y recupera tu sesión.</w:t>
+      </w:r>
+    </w:p>
+    <w:p>
+      <w:pPr>
+        <w:spacing w:after="40"/>
+        <w:ind w:left="510" w:hanging="283"/>
+      </w:pPr>
+      <w:r>
+        <w:t xml:space="preserve">• </w:t>
+      </w:r>
+      <w:r>
+        <w:rPr/>
+        <w:t xml:space="preserve">Si algo se rompe y quieres empezar de cero, elimina el Codespace y crea uno nuevo (volverás a completar </w:t>
+      </w:r>
+      <w:r>
+        <w:rPr>
+          <w:rFonts w:ascii="Consolas" w:hAnsi="Consolas"/>
+          <w:color w:val="9C2B2B"/>
+        </w:rPr>
+        <w:t>.env</w:t>
+      </w:r>
+      <w:r>
+        <w:rPr/>
+        <w:t xml:space="preserve"> y </w:t>
+      </w:r>
+      <w:r>
+        <w:rPr>
+          <w:rFonts w:ascii="Consolas" w:hAnsi="Consolas"/>
+          <w:color w:val="9C2B2B"/>
+        </w:rPr>
+        <w:t>az login</w:t>
+      </w:r>
+      <w:r>
+        <w:rPr/>
+        <w:t>).</w:t>
       </w:r>
     </w:p>
     <w:p>

</xml_diff>